<commit_message>
feat: adicionando horas pro contrato
</commit_message>
<xml_diff>
--- a/backend/storage/app/base_documents/guarulhos/contratoEstagio.docx
+++ b/backend/storage/app/base_documents/guarulhos/contratoEstagio.docx
@@ -971,7 +971,23 @@
         </w:rPr>
         <w:t>c)</w:t>
         <w:tab/>
-        <w:t xml:space="preserve">A Formação em Contexto de Trabalho comporta um total de 600 horas, as quais decorrerão no período compreendido entre </w:t>
+        <w:t xml:space="preserve">A Formação em Contexto de Trabalho comporta um total de </w:t>
+      </w:r>
+      <w:r>
+        <w:rPr>
+          <w:rFonts w:ascii="Trebuchet MS" w:hAnsi="Trebuchet MS"/>
+          <w:sz w:val="18"/>
+          <w:szCs w:val="18"/>
+        </w:rPr>
+        <w:t>${fctHours}</w:t>
+      </w:r>
+      <w:r>
+        <w:rPr>
+          <w:rFonts w:ascii="Trebuchet MS" w:hAnsi="Trebuchet MS"/>
+          <w:sz w:val="18"/>
+          <w:szCs w:val="18"/>
+        </w:rPr>
+        <w:t xml:space="preserve"> horas, as quais decorrerão no período compreendido entre </w:t>
       </w:r>
       <w:r>
         <w:rPr>
@@ -1715,25 +1731,7 @@
           <w:sz w:val="18"/>
           <w:szCs w:val="18"/>
         </w:rPr>
-        <w:t>${</w:t>
-      </w:r>
-      <w:r>
-        <w:rPr>
-          <w:rFonts w:eastAsia="Arial" w:cs="Arial" w:ascii="Trebuchet MS" w:hAnsi="Trebuchet MS"/>
-          <w:color w:val="00000A"/>
-          <w:sz w:val="18"/>
-          <w:szCs w:val="18"/>
-        </w:rPr>
-        <w:t>ufEmpresa</w:t>
-      </w:r>
-      <w:r>
-        <w:rPr>
-          <w:rFonts w:eastAsia="Arial" w:cs="Arial" w:ascii="Trebuchet MS" w:hAnsi="Trebuchet MS"/>
-          <w:color w:val="00000A"/>
-          <w:sz w:val="18"/>
-          <w:szCs w:val="18"/>
-        </w:rPr>
-        <w:t>}</w:t>
+        <w:t>${ufEmpresa}</w:t>
       </w:r>
       <w:r>
         <w:rPr>
@@ -1946,7 +1944,6 @@
         <w:szCs w:val="14"/>
       </w:rPr>
     </w:pPr>
-    <w:bookmarkStart w:id="0" w:name="_Hlk194530784"/>
     <w:r>
       <w:rPr>
         <w:rFonts w:eastAsia="Trebuchet MS" w:cs="Trebuchet MS" w:ascii="Trebuchet MS" w:hAnsi="Trebuchet MS"/>
@@ -1985,7 +1982,7 @@
         <w:szCs w:val="14"/>
       </w:rPr>
     </w:pPr>
-    <w:bookmarkStart w:id="1" w:name="_Hlk194530784"/>
+    <w:bookmarkStart w:id="0" w:name="_Hlk194530784"/>
     <w:r>
       <w:rPr>
         <w:rFonts w:eastAsia="Trebuchet MS" w:cs="Trebuchet MS" w:ascii="Trebuchet MS" w:hAnsi="Trebuchet MS"/>
@@ -1994,7 +1991,7 @@
       </w:rPr>
       <w:t>Telefone. ${telefoneEscola}</w:t>
     </w:r>
-    <w:bookmarkEnd w:id="1"/>
+    <w:bookmarkEnd w:id="0"/>
   </w:p>
   <w:p>
     <w:pPr>
@@ -2151,7 +2148,6 @@
         <w:szCs w:val="14"/>
       </w:rPr>
     </w:pPr>
-    <w:bookmarkStart w:id="2" w:name="_Hlk194530784"/>
     <w:r>
       <w:rPr>
         <w:rFonts w:eastAsia="Trebuchet MS" w:cs="Trebuchet MS" w:ascii="Trebuchet MS" w:hAnsi="Trebuchet MS"/>
@@ -2190,7 +2186,7 @@
         <w:szCs w:val="14"/>
       </w:rPr>
     </w:pPr>
-    <w:bookmarkStart w:id="3" w:name="_Hlk194530784"/>
+    <w:bookmarkStart w:id="1" w:name="_Hlk194530784"/>
     <w:r>
       <w:rPr>
         <w:rFonts w:eastAsia="Trebuchet MS" w:cs="Trebuchet MS" w:ascii="Trebuchet MS" w:hAnsi="Trebuchet MS"/>
@@ -2199,7 +2195,7 @@
       </w:rPr>
       <w:t>Telefone. ${telefoneEscola}</w:t>
     </w:r>
-    <w:bookmarkEnd w:id="3"/>
+    <w:bookmarkEnd w:id="1"/>
   </w:p>
   <w:p>
     <w:pPr>
@@ -2411,7 +2407,7 @@
         </wp:anchor>
       </w:drawing>
       <w:drawing>
-        <wp:anchor behindDoc="0" distT="0" distB="0" distL="114300" distR="114300" simplePos="0" locked="0" layoutInCell="0" allowOverlap="1" relativeHeight="13">
+        <wp:anchor behindDoc="0" distT="0" distB="0" distL="114300" distR="114300" simplePos="0" locked="0" layoutInCell="0" allowOverlap="1" relativeHeight="14">
           <wp:simplePos x="0" y="0"/>
           <wp:positionH relativeFrom="column">
             <wp:posOffset>-451485</wp:posOffset>
@@ -2483,7 +2479,7 @@
       <mc:AlternateContent>
         <mc:Choice Requires="wps">
           <w:drawing>
-            <wp:anchor behindDoc="1" distT="0" distB="0" distL="0" distR="0" simplePos="0" locked="0" layoutInCell="0" allowOverlap="1" relativeHeight="7" wp14:anchorId="6FB90955">
+            <wp:anchor behindDoc="1" distT="5080" distB="5080" distL="5080" distR="5080" simplePos="0" locked="0" layoutInCell="0" allowOverlap="1" relativeHeight="7" wp14:anchorId="6FB90955">
               <wp:simplePos x="0" y="0"/>
               <wp:positionH relativeFrom="page">
                 <wp:posOffset>719455</wp:posOffset>
@@ -2538,7 +2534,7 @@
         </mc:Fallback>
       </mc:AlternateContent>
       <w:drawing>
-        <wp:anchor behindDoc="1" distT="0" distB="0" distL="0" distR="0" simplePos="0" locked="0" layoutInCell="0" allowOverlap="1" relativeHeight="10">
+        <wp:anchor behindDoc="1" distT="0" distB="0" distL="0" distR="0" simplePos="0" locked="0" layoutInCell="0" allowOverlap="1" relativeHeight="11">
           <wp:simplePos x="0" y="0"/>
           <wp:positionH relativeFrom="page">
             <wp:posOffset>6061710</wp:posOffset>
@@ -2644,7 +2640,7 @@
         </wp:anchor>
       </w:drawing>
       <w:drawing>
-        <wp:anchor behindDoc="0" distT="0" distB="0" distL="114300" distR="114300" simplePos="0" locked="0" layoutInCell="0" allowOverlap="1" relativeHeight="13">
+        <wp:anchor behindDoc="0" distT="0" distB="0" distL="114300" distR="114300" simplePos="0" locked="0" layoutInCell="0" allowOverlap="1" relativeHeight="14">
           <wp:simplePos x="0" y="0"/>
           <wp:positionH relativeFrom="column">
             <wp:posOffset>-451485</wp:posOffset>
@@ -2716,7 +2712,7 @@
       <mc:AlternateContent>
         <mc:Choice Requires="wps">
           <w:drawing>
-            <wp:anchor behindDoc="1" distT="0" distB="0" distL="0" distR="0" simplePos="0" locked="0" layoutInCell="0" allowOverlap="1" relativeHeight="7" wp14:anchorId="6FB90955">
+            <wp:anchor behindDoc="1" distT="5080" distB="5080" distL="5080" distR="5080" simplePos="0" locked="0" layoutInCell="0" allowOverlap="1" relativeHeight="7" wp14:anchorId="6FB90955">
               <wp:simplePos x="0" y="0"/>
               <wp:positionH relativeFrom="page">
                 <wp:posOffset>719455</wp:posOffset>
@@ -2771,7 +2767,7 @@
         </mc:Fallback>
       </mc:AlternateContent>
       <w:drawing>
-        <wp:anchor behindDoc="1" distT="0" distB="0" distL="0" distR="0" simplePos="0" locked="0" layoutInCell="0" allowOverlap="1" relativeHeight="10">
+        <wp:anchor behindDoc="1" distT="0" distB="0" distL="0" distR="0" simplePos="0" locked="0" layoutInCell="0" allowOverlap="1" relativeHeight="11">
           <wp:simplePos x="0" y="0"/>
           <wp:positionH relativeFrom="page">
             <wp:posOffset>6061710</wp:posOffset>
@@ -2844,6 +2840,7 @@
         <w:vertAlign w:val="baseline"/>
         <w:position w:val="0"/>
         <w:sz w:val="20"/>
+        <w:sz w:val="20"/>
         <w:spacing w:val="0"/>
         <w:kern w:val="0"/>
         <w:w w:val="100"/>
@@ -2871,6 +2868,7 @@
         <w:vertAlign w:val="baseline"/>
         <w:position w:val="0"/>
         <w:sz w:val="20"/>
+        <w:sz w:val="20"/>
         <w:spacing w:val="0"/>
         <w:kern w:val="0"/>
         <w:w w:val="100"/>
@@ -2898,6 +2896,7 @@
         <w:vertAlign w:val="baseline"/>
         <w:position w:val="0"/>
         <w:sz w:val="20"/>
+        <w:sz w:val="20"/>
         <w:spacing w:val="0"/>
         <w:kern w:val="0"/>
         <w:w w:val="100"/>
@@ -2925,6 +2924,7 @@
         <w:vertAlign w:val="baseline"/>
         <w:position w:val="0"/>
         <w:sz w:val="20"/>
+        <w:sz w:val="20"/>
         <w:spacing w:val="0"/>
         <w:kern w:val="0"/>
         <w:w w:val="100"/>
@@ -2952,6 +2952,7 @@
         <w:vertAlign w:val="baseline"/>
         <w:position w:val="0"/>
         <w:sz w:val="20"/>
+        <w:sz w:val="20"/>
         <w:spacing w:val="0"/>
         <w:kern w:val="0"/>
         <w:w w:val="100"/>
@@ -2979,6 +2980,7 @@
         <w:vertAlign w:val="baseline"/>
         <w:position w:val="0"/>
         <w:sz w:val="20"/>
+        <w:sz w:val="20"/>
         <w:spacing w:val="0"/>
         <w:kern w:val="0"/>
         <w:w w:val="100"/>
@@ -3006,6 +3008,7 @@
         <w:vertAlign w:val="baseline"/>
         <w:position w:val="0"/>
         <w:sz w:val="20"/>
+        <w:sz w:val="20"/>
         <w:spacing w:val="0"/>
         <w:kern w:val="0"/>
         <w:w w:val="100"/>
@@ -3033,6 +3036,7 @@
         <w:vertAlign w:val="baseline"/>
         <w:position w:val="0"/>
         <w:sz w:val="20"/>
+        <w:sz w:val="20"/>
         <w:spacing w:val="0"/>
         <w:kern w:val="0"/>
         <w:w w:val="100"/>
@@ -3059,6 +3063,7 @@
         <w:strike w:val="false"/>
         <w:vertAlign w:val="baseline"/>
         <w:position w:val="0"/>
+        <w:sz w:val="20"/>
         <w:sz w:val="20"/>
         <w:spacing w:val="0"/>
         <w:kern w:val="0"/>
@@ -3594,13 +3599,13 @@
     <w:qFormat/>
     <w:pPr>
       <w:widowControl/>
-      <w:pBdr/>
+      <w:suppressAutoHyphens w:val="true"/>
       <w:bidi w:val="0"/>
       <w:spacing w:before="0" w:after="0"/>
       <w:jc w:val="left"/>
     </w:pPr>
     <w:rPr>
-      <w:rFonts w:cs="Arial Unicode MS" w:ascii="Times New Roman" w:hAnsi="Times New Roman" w:eastAsia="Arial Unicode MS"/>
+      <w:rFonts w:ascii="Times New Roman" w:hAnsi="Times New Roman" w:eastAsia="Arial Unicode MS" w:cs="Arial Unicode MS"/>
       <w:color w:val="000000"/>
       <w:kern w:val="0"/>
       <w:sz w:val="24"/>
@@ -3622,14 +3627,14 @@
     <w:pPr>
       <w:keepNext w:val="true"/>
       <w:widowControl/>
-      <w:pBdr/>
+      <w:suppressAutoHyphens w:val="true"/>
       <w:bidi w:val="0"/>
       <w:spacing w:before="0" w:after="0"/>
       <w:jc w:val="center"/>
       <w:outlineLvl w:val="0"/>
     </w:pPr>
     <w:rPr>
-      <w:rFonts w:ascii="Arial" w:hAnsi="Arial" w:cs="Arial Unicode MS" w:eastAsia="Arial Unicode MS"/>
+      <w:rFonts w:ascii="Arial" w:hAnsi="Arial" w:eastAsia="Arial Unicode MS" w:cs="Arial Unicode MS"/>
       <w:b/>
       <w:bCs/>
       <w:color w:val="000000"/>
@@ -3692,7 +3697,7 @@
     <w:name w:val="Body Text"/>
     <w:pPr>
       <w:widowControl/>
-      <w:pBdr/>
+      <w:suppressAutoHyphens w:val="true"/>
       <w:bidi w:val="0"/>
       <w:spacing w:lineRule="auto" w:line="360" w:before="0" w:after="0"/>
       <w:jc w:val="both"/>
@@ -3742,6 +3747,39 @@
       <w:rFonts w:cs="Noto Sans Devanagari"/>
     </w:rPr>
   </w:style>
+  <w:style w:type="paragraph" w:styleId="Ttulouser">
+    <w:name w:val="Título (user)"/>
+    <w:basedOn w:val="Normal"/>
+    <w:next w:val="BodyText"/>
+    <w:qFormat/>
+    <w:pPr>
+      <w:keepNext w:val="true"/>
+      <w:spacing w:before="240" w:after="120"/>
+    </w:pPr>
+    <w:rPr>
+      <w:rFonts w:ascii="Liberation Sans" w:hAnsi="Liberation Sans" w:eastAsia="Noto Sans CJK SC" w:cs="Noto Sans Devanagari"/>
+      <w:sz w:val="28"/>
+      <w:szCs w:val="28"/>
+    </w:rPr>
+  </w:style>
+  <w:style w:type="paragraph" w:styleId="ndiceuser">
+    <w:name w:val="Índice (user)"/>
+    <w:basedOn w:val="Normal"/>
+    <w:qFormat/>
+    <w:pPr>
+      <w:suppressLineNumbers/>
+    </w:pPr>
+    <w:rPr>
+      <w:rFonts w:cs="Noto Sans Devanagari"/>
+    </w:rPr>
+  </w:style>
+  <w:style w:type="paragraph" w:styleId="Cabealhoerodapuser">
+    <w:name w:val="Cabeçalho e rodapé (user)"/>
+    <w:basedOn w:val="Normal"/>
+    <w:qFormat/>
+    <w:pPr/>
+    <w:rPr/>
+  </w:style>
   <w:style w:type="paragraph" w:styleId="Cabealhoerodap">
     <w:name w:val="Cabeçalho e rodapé"/>
     <w:basedOn w:val="Normal"/>
@@ -3753,18 +3791,18 @@
     <w:name w:val="footer"/>
     <w:pPr>
       <w:widowControl/>
-      <w:pBdr/>
       <w:tabs>
         <w:tab w:val="clear" w:pos="708"/>
         <w:tab w:val="center" w:pos="4252" w:leader="none"/>
         <w:tab w:val="right" w:pos="8504" w:leader="none"/>
       </w:tabs>
+      <w:suppressAutoHyphens w:val="true"/>
       <w:bidi w:val="0"/>
       <w:spacing w:before="0" w:after="0"/>
       <w:jc w:val="left"/>
     </w:pPr>
     <w:rPr>
-      <w:rFonts w:cs="Arial Unicode MS" w:ascii="Times New Roman" w:hAnsi="Times New Roman" w:eastAsia="Arial Unicode MS"/>
+      <w:rFonts w:ascii="Times New Roman" w:hAnsi="Times New Roman" w:eastAsia="Arial Unicode MS" w:cs="Arial Unicode MS"/>
       <w:color w:val="000000"/>
       <w:kern w:val="0"/>
       <w:sz w:val="24"/>
@@ -3778,13 +3816,13 @@
     <w:qFormat/>
     <w:pPr>
       <w:widowControl/>
-      <w:pBdr/>
+      <w:suppressAutoHyphens w:val="true"/>
       <w:bidi w:val="0"/>
       <w:spacing w:lineRule="auto" w:line="360" w:before="0" w:after="0"/>
       <w:jc w:val="both"/>
     </w:pPr>
     <w:rPr>
-      <w:rFonts w:ascii="Arial" w:hAnsi="Arial" w:cs="Arial Unicode MS" w:eastAsia="Arial Unicode MS"/>
+      <w:rFonts w:ascii="Arial" w:hAnsi="Arial" w:eastAsia="Arial Unicode MS" w:cs="Arial Unicode MS"/>
       <w:color w:val="000000"/>
       <w:kern w:val="0"/>
       <w:sz w:val="22"/>
@@ -3809,8 +3847,8 @@
     </w:pPr>
     <w:rPr/>
   </w:style>
-  <w:style w:type="numbering" w:styleId="Semlista" w:default="1">
-    <w:name w:val="Sem lista"/>
+  <w:style w:type="numbering" w:styleId="Semlistauser" w:default="1">
+    <w:name w:val="Sem lista (user)"/>
     <w:uiPriority w:val="99"/>
     <w:semiHidden/>
     <w:unhideWhenUsed/>

</xml_diff>

<commit_message>
trocando botao para submeter para assinatura
</commit_message>
<xml_diff>
--- a/backend/storage/app/base_documents/guarulhos/contratoEstagio.docx
+++ b/backend/storage/app/base_documents/guarulhos/contratoEstagio.docx
@@ -125,7 +125,27 @@
           <w:sz w:val="20"/>
           <w:szCs w:val="20"/>
         </w:rPr>
-        <w:t>${razaoSocialEscola}</w:t>
+        <w:t>${</w:t>
+      </w:r>
+      <w:proofErr w:type="spellStart"/>
+      <w:r>
+        <w:rPr>
+          <w:rFonts w:ascii="Trebuchet MS" w:eastAsia="Arial" w:hAnsi="Trebuchet MS" w:cs="Arial"/>
+          <w:color w:val="00000A"/>
+          <w:sz w:val="20"/>
+          <w:szCs w:val="20"/>
+        </w:rPr>
+        <w:t>razaoSocialEscola</w:t>
+      </w:r>
+      <w:proofErr w:type="spellEnd"/>
+      <w:r>
+        <w:rPr>
+          <w:rFonts w:ascii="Trebuchet MS" w:eastAsia="Arial" w:hAnsi="Trebuchet MS" w:cs="Arial"/>
+          <w:color w:val="00000A"/>
+          <w:sz w:val="20"/>
+          <w:szCs w:val="20"/>
+        </w:rPr>
+        <w:t>}</w:t>
       </w:r>
       <w:r>
         <w:rPr>
@@ -142,16 +162,117 @@
           <w:sz w:val="20"/>
           <w:szCs w:val="20"/>
         </w:rPr>
-        <w:t xml:space="preserve">${enderecoEscola}, ${numeroEscola}, ${bairroEscola} -${cidadeEscola} - ${cepEscola} </w:t>
-      </w:r>
-      <w:r>
-        <w:rPr>
-          <w:rFonts w:ascii="Trebuchet MS" w:hAnsi="Trebuchet MS"/>
-          <w:sz w:val="20"/>
-          <w:szCs w:val="20"/>
-        </w:rPr>
-        <w:t xml:space="preserve"> representado por ${</w:t>
-      </w:r>
+        <w:t>${</w:t>
+      </w:r>
+      <w:proofErr w:type="spellStart"/>
+      <w:r>
+        <w:rPr>
+          <w:rFonts w:ascii="Trebuchet MS" w:eastAsia="Arial" w:hAnsi="Trebuchet MS" w:cs="Arial"/>
+          <w:color w:val="00000A"/>
+          <w:sz w:val="20"/>
+          <w:szCs w:val="20"/>
+        </w:rPr>
+        <w:t>enderecoEscola</w:t>
+      </w:r>
+      <w:proofErr w:type="spellEnd"/>
+      <w:r>
+        <w:rPr>
+          <w:rFonts w:ascii="Trebuchet MS" w:eastAsia="Arial" w:hAnsi="Trebuchet MS" w:cs="Arial"/>
+          <w:color w:val="00000A"/>
+          <w:sz w:val="20"/>
+          <w:szCs w:val="20"/>
+        </w:rPr>
+        <w:t>}, ${</w:t>
+      </w:r>
+      <w:proofErr w:type="spellStart"/>
+      <w:r>
+        <w:rPr>
+          <w:rFonts w:ascii="Trebuchet MS" w:eastAsia="Arial" w:hAnsi="Trebuchet MS" w:cs="Arial"/>
+          <w:color w:val="00000A"/>
+          <w:sz w:val="20"/>
+          <w:szCs w:val="20"/>
+        </w:rPr>
+        <w:t>numeroEscola</w:t>
+      </w:r>
+      <w:proofErr w:type="spellEnd"/>
+      <w:r>
+        <w:rPr>
+          <w:rFonts w:ascii="Trebuchet MS" w:eastAsia="Arial" w:hAnsi="Trebuchet MS" w:cs="Arial"/>
+          <w:color w:val="00000A"/>
+          <w:sz w:val="20"/>
+          <w:szCs w:val="20"/>
+        </w:rPr>
+        <w:t>}, ${</w:t>
+      </w:r>
+      <w:proofErr w:type="spellStart"/>
+      <w:r>
+        <w:rPr>
+          <w:rFonts w:ascii="Trebuchet MS" w:eastAsia="Arial" w:hAnsi="Trebuchet MS" w:cs="Arial"/>
+          <w:color w:val="00000A"/>
+          <w:sz w:val="20"/>
+          <w:szCs w:val="20"/>
+        </w:rPr>
+        <w:t>bairroEscola</w:t>
+      </w:r>
+      <w:proofErr w:type="spellEnd"/>
+      <w:r>
+        <w:rPr>
+          <w:rFonts w:ascii="Trebuchet MS" w:eastAsia="Arial" w:hAnsi="Trebuchet MS" w:cs="Arial"/>
+          <w:color w:val="00000A"/>
+          <w:sz w:val="20"/>
+          <w:szCs w:val="20"/>
+        </w:rPr>
+        <w:t>} -${</w:t>
+      </w:r>
+      <w:proofErr w:type="spellStart"/>
+      <w:r>
+        <w:rPr>
+          <w:rFonts w:ascii="Trebuchet MS" w:eastAsia="Arial" w:hAnsi="Trebuchet MS" w:cs="Arial"/>
+          <w:color w:val="00000A"/>
+          <w:sz w:val="20"/>
+          <w:szCs w:val="20"/>
+        </w:rPr>
+        <w:t>cidadeEscola</w:t>
+      </w:r>
+      <w:proofErr w:type="spellEnd"/>
+      <w:r>
+        <w:rPr>
+          <w:rFonts w:ascii="Trebuchet MS" w:eastAsia="Arial" w:hAnsi="Trebuchet MS" w:cs="Arial"/>
+          <w:color w:val="00000A"/>
+          <w:sz w:val="20"/>
+          <w:szCs w:val="20"/>
+        </w:rPr>
+        <w:t>} - ${</w:t>
+      </w:r>
+      <w:proofErr w:type="spellStart"/>
+      <w:r>
+        <w:rPr>
+          <w:rFonts w:ascii="Trebuchet MS" w:eastAsia="Arial" w:hAnsi="Trebuchet MS" w:cs="Arial"/>
+          <w:color w:val="00000A"/>
+          <w:sz w:val="20"/>
+          <w:szCs w:val="20"/>
+        </w:rPr>
+        <w:t>cepEscola</w:t>
+      </w:r>
+      <w:proofErr w:type="spellEnd"/>
+      <w:r>
+        <w:rPr>
+          <w:rFonts w:ascii="Trebuchet MS" w:eastAsia="Arial" w:hAnsi="Trebuchet MS" w:cs="Arial"/>
+          <w:color w:val="00000A"/>
+          <w:sz w:val="20"/>
+          <w:szCs w:val="20"/>
+        </w:rPr>
+        <w:t xml:space="preserve">} </w:t>
+      </w:r>
+      <w:r>
+        <w:rPr>
+          <w:rFonts w:ascii="Trebuchet MS" w:hAnsi="Trebuchet MS"/>
+          <w:sz w:val="20"/>
+          <w:szCs w:val="20"/>
+        </w:rPr>
+        <w:t>representado por ${</w:t>
+      </w:r>
+      <w:proofErr w:type="spellStart"/>
       <w:r>
         <w:rPr>
           <w:rFonts w:ascii="Trebuchet MS" w:hAnsi="Trebuchet MS"/>
@@ -159,7 +280,17 @@
           <w:szCs w:val="20"/>
           <w:lang w:val="pt-BR"/>
         </w:rPr>
-        <w:t>responsavelEscola}</w:t>
+        <w:t>responsavelEscola</w:t>
+      </w:r>
+      <w:proofErr w:type="spellEnd"/>
+      <w:r>
+        <w:rPr>
+          <w:rFonts w:ascii="Trebuchet MS" w:hAnsi="Trebuchet MS"/>
+          <w:sz w:val="20"/>
+          <w:szCs w:val="20"/>
+          <w:lang w:val="pt-BR"/>
+        </w:rPr>
+        <w:t>}</w:t>
       </w:r>
       <w:r>
         <w:rPr>
@@ -169,6 +300,7 @@
         </w:rPr>
         <w:t>, ${</w:t>
       </w:r>
+      <w:proofErr w:type="spellStart"/>
       <w:r>
         <w:rPr>
           <w:rFonts w:ascii="Trebuchet MS" w:hAnsi="Trebuchet MS"/>
@@ -176,8 +308,19 @@
           <w:szCs w:val="20"/>
           <w:lang w:val="pt-BR"/>
         </w:rPr>
-        <w:t xml:space="preserve">responsavelFuncaoEscola} </w:t>
-      </w:r>
+        <w:t>responsavelFuncaoEscola</w:t>
+      </w:r>
+      <w:proofErr w:type="spellEnd"/>
+      <w:r>
+        <w:rPr>
+          <w:rFonts w:ascii="Trebuchet MS" w:hAnsi="Trebuchet MS"/>
+          <w:sz w:val="20"/>
+          <w:szCs w:val="20"/>
+          <w:lang w:val="pt-BR"/>
+        </w:rPr>
+        <w:t xml:space="preserve">} </w:t>
+      </w:r>
+      <w:proofErr w:type="gramStart"/>
       <w:r>
         <w:rPr>
           <w:rFonts w:ascii="Trebuchet MS" w:hAnsi="Trebuchet MS"/>
@@ -188,12 +331,50 @@
       </w:r>
       <w:r>
         <w:rPr>
-          <w:rFonts w:ascii="Trebuchet MS" w:eastAsia="Arial" w:hAnsi="Trebuchet MS" w:cs="Arial"/>
-          <w:color w:val="00000A"/>
-          <w:sz w:val="20"/>
-          <w:szCs w:val="20"/>
-        </w:rPr>
-        <w:t>${razaoSocialEscola}</w:t>
+          <w:rFonts w:ascii="Trebuchet MS" w:hAnsi="Trebuchet MS"/>
+          <w:sz w:val="20"/>
+          <w:szCs w:val="20"/>
+        </w:rPr>
+        <w:t xml:space="preserve"> </w:t>
+      </w:r>
+      <w:r>
+        <w:rPr>
+          <w:rFonts w:ascii="Trebuchet MS" w:eastAsia="Arial" w:hAnsi="Trebuchet MS" w:cs="Arial"/>
+          <w:color w:val="00000A"/>
+          <w:sz w:val="20"/>
+          <w:szCs w:val="20"/>
+        </w:rPr>
+        <w:t>$</w:t>
+      </w:r>
+      <w:proofErr w:type="gramEnd"/>
+      <w:r>
+        <w:rPr>
+          <w:rFonts w:ascii="Trebuchet MS" w:eastAsia="Arial" w:hAnsi="Trebuchet MS" w:cs="Arial"/>
+          <w:color w:val="00000A"/>
+          <w:sz w:val="20"/>
+          <w:szCs w:val="20"/>
+        </w:rPr>
+        <w:t>{</w:t>
+      </w:r>
+      <w:proofErr w:type="spellStart"/>
+      <w:r>
+        <w:rPr>
+          <w:rFonts w:ascii="Trebuchet MS" w:eastAsia="Arial" w:hAnsi="Trebuchet MS" w:cs="Arial"/>
+          <w:color w:val="00000A"/>
+          <w:sz w:val="20"/>
+          <w:szCs w:val="20"/>
+        </w:rPr>
+        <w:t>razaoSocialEscola</w:t>
+      </w:r>
+      <w:proofErr w:type="spellEnd"/>
+      <w:r>
+        <w:rPr>
+          <w:rFonts w:ascii="Trebuchet MS" w:eastAsia="Arial" w:hAnsi="Trebuchet MS" w:cs="Arial"/>
+          <w:color w:val="00000A"/>
+          <w:sz w:val="20"/>
+          <w:szCs w:val="20"/>
+        </w:rPr>
+        <w:t>}</w:t>
       </w:r>
       <w:r>
         <w:rPr>
@@ -271,7 +452,27 @@
           <w:sz w:val="20"/>
           <w:szCs w:val="20"/>
         </w:rPr>
-        <w:t>${razaoSocialEmpresa}</w:t>
+        <w:t>${</w:t>
+      </w:r>
+      <w:proofErr w:type="spellStart"/>
+      <w:r>
+        <w:rPr>
+          <w:rFonts w:ascii="Trebuchet MS" w:eastAsia="Arial" w:hAnsi="Trebuchet MS" w:cs="Arial"/>
+          <w:color w:val="00000A"/>
+          <w:sz w:val="20"/>
+          <w:szCs w:val="20"/>
+        </w:rPr>
+        <w:t>razaoSocialEmpresa</w:t>
+      </w:r>
+      <w:proofErr w:type="spellEnd"/>
+      <w:r>
+        <w:rPr>
+          <w:rFonts w:ascii="Trebuchet MS" w:eastAsia="Arial" w:hAnsi="Trebuchet MS" w:cs="Arial"/>
+          <w:color w:val="00000A"/>
+          <w:sz w:val="20"/>
+          <w:szCs w:val="20"/>
+        </w:rPr>
+        <w:t>}</w:t>
       </w:r>
       <w:r>
         <w:rPr>
@@ -281,6 +482,7 @@
         </w:rPr>
         <w:t>, representado(a) por ${</w:t>
       </w:r>
+      <w:proofErr w:type="spellStart"/>
       <w:r>
         <w:rPr>
           <w:rFonts w:ascii="Trebuchet MS" w:hAnsi="Trebuchet MS"/>
@@ -288,7 +490,17 @@
           <w:szCs w:val="20"/>
           <w:lang w:val="pt-BR"/>
         </w:rPr>
-        <w:t>supervisorEmpresa}</w:t>
+        <w:t>supervisorEmpresa</w:t>
+      </w:r>
+      <w:proofErr w:type="spellEnd"/>
+      <w:r>
+        <w:rPr>
+          <w:rFonts w:ascii="Trebuchet MS" w:hAnsi="Trebuchet MS"/>
+          <w:sz w:val="20"/>
+          <w:szCs w:val="20"/>
+          <w:lang w:val="pt-BR"/>
+        </w:rPr>
+        <w:t>}</w:t>
       </w:r>
       <w:r>
         <w:rPr>
@@ -298,6 +510,7 @@
         </w:rPr>
         <w:t>, na qualidade de ${</w:t>
       </w:r>
+      <w:proofErr w:type="spellStart"/>
       <w:r>
         <w:rPr>
           <w:rFonts w:ascii="Trebuchet MS" w:hAnsi="Trebuchet MS"/>
@@ -305,7 +518,17 @@
           <w:szCs w:val="20"/>
           <w:lang w:val="pt-BR"/>
         </w:rPr>
-        <w:t>funcaoSupervisorEmpresa}</w:t>
+        <w:t>funcaoSupervisorEmpresa</w:t>
+      </w:r>
+      <w:proofErr w:type="spellEnd"/>
+      <w:r>
+        <w:rPr>
+          <w:rFonts w:ascii="Trebuchet MS" w:hAnsi="Trebuchet MS"/>
+          <w:sz w:val="20"/>
+          <w:szCs w:val="20"/>
+          <w:lang w:val="pt-BR"/>
+        </w:rPr>
+        <w:t>}</w:t>
       </w:r>
       <w:r>
         <w:rPr>
@@ -322,7 +545,27 @@
           <w:sz w:val="20"/>
           <w:szCs w:val="20"/>
         </w:rPr>
-        <w:t>${cnpjEmpresa}</w:t>
+        <w:t>${</w:t>
+      </w:r>
+      <w:proofErr w:type="spellStart"/>
+      <w:r>
+        <w:rPr>
+          <w:rFonts w:ascii="Trebuchet MS" w:eastAsia="Arial" w:hAnsi="Trebuchet MS" w:cs="Arial"/>
+          <w:color w:val="00000A"/>
+          <w:sz w:val="20"/>
+          <w:szCs w:val="20"/>
+        </w:rPr>
+        <w:t>cnpjEmpresa</w:t>
+      </w:r>
+      <w:proofErr w:type="spellEnd"/>
+      <w:r>
+        <w:rPr>
+          <w:rFonts w:ascii="Trebuchet MS" w:eastAsia="Arial" w:hAnsi="Trebuchet MS" w:cs="Arial"/>
+          <w:color w:val="00000A"/>
+          <w:sz w:val="20"/>
+          <w:szCs w:val="20"/>
+        </w:rPr>
+        <w:t>}</w:t>
       </w:r>
       <w:r>
         <w:rPr>
@@ -339,24 +582,64 @@
           <w:sz w:val="20"/>
           <w:szCs w:val="20"/>
         </w:rPr>
-        <w:t>${caeEmpresa},</w:t>
-      </w:r>
-      <w:r>
-        <w:rPr>
-          <w:rFonts w:ascii="Trebuchet MS" w:hAnsi="Trebuchet MS"/>
-          <w:sz w:val="20"/>
-          <w:szCs w:val="20"/>
-        </w:rPr>
-        <w:t xml:space="preserve">, situada na rua : </w:t>
-      </w:r>
-      <w:r>
-        <w:rPr>
-          <w:rFonts w:ascii="Trebuchet MS" w:eastAsia="Arial" w:hAnsi="Trebuchet MS" w:cs="Arial"/>
-          <w:color w:val="00000A"/>
-          <w:sz w:val="20"/>
-          <w:szCs w:val="20"/>
-        </w:rPr>
-        <w:t>${enderecoEmpresa},</w:t>
+        <w:t>${</w:t>
+      </w:r>
+      <w:proofErr w:type="spellStart"/>
+      <w:r>
+        <w:rPr>
+          <w:rFonts w:ascii="Trebuchet MS" w:eastAsia="Arial" w:hAnsi="Trebuchet MS" w:cs="Arial"/>
+          <w:color w:val="00000A"/>
+          <w:sz w:val="20"/>
+          <w:szCs w:val="20"/>
+        </w:rPr>
+        <w:t>caeEmpresa</w:t>
+      </w:r>
+      <w:proofErr w:type="spellEnd"/>
+      <w:r>
+        <w:rPr>
+          <w:rFonts w:ascii="Trebuchet MS" w:eastAsia="Arial" w:hAnsi="Trebuchet MS" w:cs="Arial"/>
+          <w:color w:val="00000A"/>
+          <w:sz w:val="20"/>
+          <w:szCs w:val="20"/>
+        </w:rPr>
+        <w:t>}</w:t>
+      </w:r>
+      <w:r>
+        <w:rPr>
+          <w:rFonts w:ascii="Trebuchet MS" w:hAnsi="Trebuchet MS"/>
+          <w:sz w:val="20"/>
+          <w:szCs w:val="20"/>
+        </w:rPr>
+        <w:t xml:space="preserve">, situada na rua: </w:t>
+      </w:r>
+      <w:r>
+        <w:rPr>
+          <w:rFonts w:ascii="Trebuchet MS" w:eastAsia="Arial" w:hAnsi="Trebuchet MS" w:cs="Arial"/>
+          <w:color w:val="00000A"/>
+          <w:sz w:val="20"/>
+          <w:szCs w:val="20"/>
+        </w:rPr>
+        <w:t>${</w:t>
+      </w:r>
+      <w:proofErr w:type="spellStart"/>
+      <w:r>
+        <w:rPr>
+          <w:rFonts w:ascii="Trebuchet MS" w:eastAsia="Arial" w:hAnsi="Trebuchet MS" w:cs="Arial"/>
+          <w:color w:val="00000A"/>
+          <w:sz w:val="20"/>
+          <w:szCs w:val="20"/>
+        </w:rPr>
+        <w:t>enderecoEmpresa</w:t>
+      </w:r>
+      <w:proofErr w:type="spellEnd"/>
+      <w:r>
+        <w:rPr>
+          <w:rFonts w:ascii="Trebuchet MS" w:eastAsia="Arial" w:hAnsi="Trebuchet MS" w:cs="Arial"/>
+          <w:color w:val="00000A"/>
+          <w:sz w:val="20"/>
+          <w:szCs w:val="20"/>
+        </w:rPr>
+        <w:t>},</w:t>
       </w:r>
       <w:r>
         <w:rPr>
@@ -373,7 +656,27 @@
           <w:sz w:val="20"/>
           <w:szCs w:val="20"/>
         </w:rPr>
-        <w:t xml:space="preserve">${numeroEmpresa} </w:t>
+        <w:t>${</w:t>
+      </w:r>
+      <w:proofErr w:type="spellStart"/>
+      <w:r>
+        <w:rPr>
+          <w:rFonts w:ascii="Trebuchet MS" w:eastAsia="Arial" w:hAnsi="Trebuchet MS" w:cs="Arial"/>
+          <w:color w:val="00000A"/>
+          <w:sz w:val="20"/>
+          <w:szCs w:val="20"/>
+        </w:rPr>
+        <w:t>numeroEmpresa</w:t>
+      </w:r>
+      <w:proofErr w:type="spellEnd"/>
+      <w:r>
+        <w:rPr>
+          <w:rFonts w:ascii="Trebuchet MS" w:eastAsia="Arial" w:hAnsi="Trebuchet MS" w:cs="Arial"/>
+          <w:color w:val="00000A"/>
+          <w:sz w:val="20"/>
+          <w:szCs w:val="20"/>
+        </w:rPr>
+        <w:t xml:space="preserve">} </w:t>
       </w:r>
       <w:r>
         <w:rPr>
@@ -390,15 +693,35 @@
           <w:sz w:val="20"/>
           <w:szCs w:val="20"/>
         </w:rPr>
-        <w:t>${cepEmpresa}</w:t>
-      </w:r>
-      <w:r>
-        <w:rPr>
-          <w:rFonts w:ascii="Trebuchet MS" w:hAnsi="Trebuchet MS"/>
-          <w:sz w:val="20"/>
-          <w:szCs w:val="20"/>
-        </w:rPr>
-        <w:t xml:space="preserve">, </w:t>
+        <w:t>${</w:t>
+      </w:r>
+      <w:proofErr w:type="spellStart"/>
+      <w:r>
+        <w:rPr>
+          <w:rFonts w:ascii="Trebuchet MS" w:eastAsia="Arial" w:hAnsi="Trebuchet MS" w:cs="Arial"/>
+          <w:color w:val="00000A"/>
+          <w:sz w:val="20"/>
+          <w:szCs w:val="20"/>
+        </w:rPr>
+        <w:t>cepEmpresa</w:t>
+      </w:r>
+      <w:proofErr w:type="spellEnd"/>
+      <w:r>
+        <w:rPr>
+          <w:rFonts w:ascii="Trebuchet MS" w:eastAsia="Arial" w:hAnsi="Trebuchet MS" w:cs="Arial"/>
+          <w:color w:val="00000A"/>
+          <w:sz w:val="20"/>
+          <w:szCs w:val="20"/>
+        </w:rPr>
+        <w:t>}</w:t>
+      </w:r>
+      <w:r>
+        <w:rPr>
+          <w:rFonts w:ascii="Trebuchet MS" w:hAnsi="Trebuchet MS"/>
+          <w:sz w:val="20"/>
+          <w:szCs w:val="20"/>
+        </w:rPr>
+        <w:t>.</w:t>
       </w:r>
     </w:p>
     <w:p>
@@ -493,7 +816,25 @@
           <w:sz w:val="20"/>
           <w:szCs w:val="20"/>
         </w:rPr>
-        <w:t>O presente protocolo tem por objetivo estabelecer, entre as partes, as atividades a desenvolver pelo formando durante a formação prática em contexto real de trabalho (Formação em Contexto de Trabalho). A formação prática, estruturada num plano individual de formação ou roteiro de actividades a desenvolver em contexto de trabalho, visa a aquisição e o desenvolvimento de competências técnicas, relacionais, organizacionais e de gestão de carreira relevantes para a qualificação profissional a adquirir, para a inserção no mundo de trabalho e para a formação ao longo da vida.</w:t>
+        <w:t xml:space="preserve">O presente protocolo tem por objetivo estabelecer, entre as partes, as atividades a desenvolver pelo formando durante a formação prática em contexto real de trabalho (Formação em Contexto de Trabalho). A formação prática, estruturada num plano individual de formação ou roteiro de </w:t>
+      </w:r>
+      <w:proofErr w:type="spellStart"/>
+      <w:r>
+        <w:rPr>
+          <w:rFonts w:ascii="Trebuchet MS" w:hAnsi="Trebuchet MS"/>
+          <w:sz w:val="20"/>
+          <w:szCs w:val="20"/>
+        </w:rPr>
+        <w:t>actividades</w:t>
+      </w:r>
+      <w:proofErr w:type="spellEnd"/>
+      <w:r>
+        <w:rPr>
+          <w:rFonts w:ascii="Trebuchet MS" w:hAnsi="Trebuchet MS"/>
+          <w:sz w:val="20"/>
+          <w:szCs w:val="20"/>
+        </w:rPr>
+        <w:t xml:space="preserve"> a desenvolver em contexto de trabalho, visa a aquisição e o desenvolvimento de competências técnicas, relacionais, organizacionais e de gestão de carreira relevantes para a qualificação profissional a adquirir, para a inserção no mundo de trabalho e para a formação ao longo da vida.</w:t>
       </w:r>
     </w:p>
     <w:p>
@@ -544,6 +885,7 @@
         </w:rPr>
         <w:t>O segundo outorgante irá promover a Formação em Contexto de Trabalho no âmbito do ${</w:t>
       </w:r>
+      <w:proofErr w:type="spellStart"/>
       <w:r>
         <w:rPr>
           <w:rFonts w:ascii="Trebuchet MS" w:hAnsi="Trebuchet MS"/>
@@ -551,7 +893,17 @@
           <w:szCs w:val="20"/>
           <w:lang w:val="pt-BR"/>
         </w:rPr>
-        <w:t>cursoCandidato}</w:t>
+        <w:t>cursoCandidato</w:t>
+      </w:r>
+      <w:proofErr w:type="spellEnd"/>
+      <w:r>
+        <w:rPr>
+          <w:rFonts w:ascii="Trebuchet MS" w:hAnsi="Trebuchet MS"/>
+          <w:sz w:val="20"/>
+          <w:szCs w:val="20"/>
+          <w:lang w:val="pt-BR"/>
+        </w:rPr>
+        <w:t>}</w:t>
       </w:r>
       <w:r>
         <w:rPr>
@@ -561,6 +913,7 @@
         </w:rPr>
         <w:t>, ${</w:t>
       </w:r>
+      <w:proofErr w:type="spellStart"/>
       <w:r>
         <w:rPr>
           <w:rFonts w:ascii="Trebuchet MS" w:hAnsi="Trebuchet MS"/>
@@ -568,7 +921,17 @@
           <w:szCs w:val="20"/>
           <w:lang w:val="pt-BR"/>
         </w:rPr>
-        <w:t>nivelCandidato}</w:t>
+        <w:t>nivelCandidato</w:t>
+      </w:r>
+      <w:proofErr w:type="spellEnd"/>
+      <w:r>
+        <w:rPr>
+          <w:rFonts w:ascii="Trebuchet MS" w:hAnsi="Trebuchet MS"/>
+          <w:sz w:val="20"/>
+          <w:szCs w:val="20"/>
+          <w:lang w:val="pt-BR"/>
+        </w:rPr>
+        <w:t>}</w:t>
       </w:r>
       <w:r>
         <w:rPr>
@@ -611,6 +974,7 @@
         </w:rPr>
         <w:t>no período da ${</w:t>
       </w:r>
+      <w:proofErr w:type="spellStart"/>
       <w:r>
         <w:rPr>
           <w:rFonts w:ascii="Trebuchet MS" w:hAnsi="Trebuchet MS"/>
@@ -620,6 +984,7 @@
         </w:rPr>
         <w:t>period</w:t>
       </w:r>
+      <w:proofErr w:type="spellEnd"/>
       <w:r>
         <w:rPr>
           <w:rFonts w:ascii="Trebuchet MS" w:hAnsi="Trebuchet MS"/>
@@ -764,7 +1129,38 @@
           <w:szCs w:val="20"/>
         </w:rPr>
         <w:tab/>
-        <w:t xml:space="preserve">${nomeCandidato}                                       </w:t>
+        <w:t>${</w:t>
+      </w:r>
+      <w:proofErr w:type="spellStart"/>
+      <w:proofErr w:type="gramStart"/>
+      <w:r>
+        <w:rPr>
+          <w:rFonts w:ascii="Trebuchet MS" w:eastAsia="Arial" w:hAnsi="Trebuchet MS" w:cs="Arial"/>
+          <w:color w:val="00000A"/>
+          <w:sz w:val="20"/>
+          <w:szCs w:val="20"/>
+        </w:rPr>
+        <w:t>nomeCandidato</w:t>
+      </w:r>
+      <w:proofErr w:type="spellEnd"/>
+      <w:r>
+        <w:rPr>
+          <w:rFonts w:ascii="Trebuchet MS" w:eastAsia="Arial" w:hAnsi="Trebuchet MS" w:cs="Arial"/>
+          <w:color w:val="00000A"/>
+          <w:sz w:val="20"/>
+          <w:szCs w:val="20"/>
+        </w:rPr>
+        <w:t xml:space="preserve">}   </w:t>
+      </w:r>
+      <w:proofErr w:type="gramEnd"/>
+      <w:r>
+        <w:rPr>
+          <w:rFonts w:ascii="Trebuchet MS" w:eastAsia="Arial" w:hAnsi="Trebuchet MS" w:cs="Arial"/>
+          <w:color w:val="00000A"/>
+          <w:sz w:val="20"/>
+          <w:szCs w:val="20"/>
+        </w:rPr>
+        <w:t xml:space="preserve">                                    </w:t>
       </w:r>
       <w:r>
         <w:rPr>
@@ -793,8 +1189,30 @@
           <w:sz w:val="20"/>
           <w:szCs w:val="20"/>
         </w:rPr>
-        <w:t xml:space="preserve"> ${nascimentoCandidato}   </w:t>
-      </w:r>
+        <w:t xml:space="preserve"> ${</w:t>
+      </w:r>
+      <w:proofErr w:type="spellStart"/>
+      <w:proofErr w:type="gramStart"/>
+      <w:r>
+        <w:rPr>
+          <w:rFonts w:ascii="Trebuchet MS" w:eastAsia="Arial" w:hAnsi="Trebuchet MS" w:cs="Arial"/>
+          <w:color w:val="00000A"/>
+          <w:sz w:val="20"/>
+          <w:szCs w:val="20"/>
+        </w:rPr>
+        <w:t>nascimentoCandidato</w:t>
+      </w:r>
+      <w:proofErr w:type="spellEnd"/>
+      <w:r>
+        <w:rPr>
+          <w:rFonts w:ascii="Trebuchet MS" w:eastAsia="Arial" w:hAnsi="Trebuchet MS" w:cs="Arial"/>
+          <w:color w:val="00000A"/>
+          <w:sz w:val="20"/>
+          <w:szCs w:val="20"/>
+        </w:rPr>
+        <w:t xml:space="preserve">}   </w:t>
+      </w:r>
+      <w:proofErr w:type="gramEnd"/>
       <w:r>
         <w:rPr>
           <w:rFonts w:ascii="Trebuchet MS" w:eastAsia="Arial" w:hAnsi="Trebuchet MS" w:cs="Arial"/>
@@ -822,7 +1240,27 @@
           <w:sz w:val="20"/>
           <w:szCs w:val="20"/>
         </w:rPr>
-        <w:t xml:space="preserve"> ${cpfCandidato}  </w:t>
+        <w:t xml:space="preserve"> ${</w:t>
+      </w:r>
+      <w:proofErr w:type="spellStart"/>
+      <w:r>
+        <w:rPr>
+          <w:rFonts w:ascii="Trebuchet MS" w:eastAsia="Arial" w:hAnsi="Trebuchet MS" w:cs="Arial"/>
+          <w:color w:val="00000A"/>
+          <w:sz w:val="20"/>
+          <w:szCs w:val="20"/>
+        </w:rPr>
+        <w:t>cpfCandidato</w:t>
+      </w:r>
+      <w:proofErr w:type="spellEnd"/>
+      <w:r>
+        <w:rPr>
+          <w:rFonts w:ascii="Trebuchet MS" w:eastAsia="Arial" w:hAnsi="Trebuchet MS" w:cs="Arial"/>
+          <w:color w:val="00000A"/>
+          <w:sz w:val="20"/>
+          <w:szCs w:val="20"/>
+        </w:rPr>
+        <w:t xml:space="preserve">}  </w:t>
       </w:r>
       <w:r>
         <w:rPr>
@@ -851,7 +1289,107 @@
           <w:sz w:val="20"/>
           <w:szCs w:val="20"/>
         </w:rPr>
-        <w:t xml:space="preserve"> ${enderecoCandidato} , ${numeroCandidato} ${bairroCandidato} - ${cidadeCandidato} - ${cepCandidato}                                  </w:t>
+        <w:t xml:space="preserve"> ${</w:t>
+      </w:r>
+      <w:proofErr w:type="spellStart"/>
+      <w:r>
+        <w:rPr>
+          <w:rFonts w:ascii="Trebuchet MS" w:eastAsia="Arial" w:hAnsi="Trebuchet MS" w:cs="Arial"/>
+          <w:color w:val="00000A"/>
+          <w:sz w:val="20"/>
+          <w:szCs w:val="20"/>
+        </w:rPr>
+        <w:t>enderecoCandidato</w:t>
+      </w:r>
+      <w:proofErr w:type="spellEnd"/>
+      <w:r>
+        <w:rPr>
+          <w:rFonts w:ascii="Trebuchet MS" w:eastAsia="Arial" w:hAnsi="Trebuchet MS" w:cs="Arial"/>
+          <w:color w:val="00000A"/>
+          <w:sz w:val="20"/>
+          <w:szCs w:val="20"/>
+        </w:rPr>
+        <w:t>}, ${</w:t>
+      </w:r>
+      <w:proofErr w:type="spellStart"/>
+      <w:r>
+        <w:rPr>
+          <w:rFonts w:ascii="Trebuchet MS" w:eastAsia="Arial" w:hAnsi="Trebuchet MS" w:cs="Arial"/>
+          <w:color w:val="00000A"/>
+          <w:sz w:val="20"/>
+          <w:szCs w:val="20"/>
+        </w:rPr>
+        <w:t>numeroCandidato</w:t>
+      </w:r>
+      <w:proofErr w:type="spellEnd"/>
+      <w:r>
+        <w:rPr>
+          <w:rFonts w:ascii="Trebuchet MS" w:eastAsia="Arial" w:hAnsi="Trebuchet MS" w:cs="Arial"/>
+          <w:color w:val="00000A"/>
+          <w:sz w:val="20"/>
+          <w:szCs w:val="20"/>
+        </w:rPr>
+        <w:t>} ${</w:t>
+      </w:r>
+      <w:proofErr w:type="spellStart"/>
+      <w:r>
+        <w:rPr>
+          <w:rFonts w:ascii="Trebuchet MS" w:eastAsia="Arial" w:hAnsi="Trebuchet MS" w:cs="Arial"/>
+          <w:color w:val="00000A"/>
+          <w:sz w:val="20"/>
+          <w:szCs w:val="20"/>
+        </w:rPr>
+        <w:t>bairroCandidato</w:t>
+      </w:r>
+      <w:proofErr w:type="spellEnd"/>
+      <w:r>
+        <w:rPr>
+          <w:rFonts w:ascii="Trebuchet MS" w:eastAsia="Arial" w:hAnsi="Trebuchet MS" w:cs="Arial"/>
+          <w:color w:val="00000A"/>
+          <w:sz w:val="20"/>
+          <w:szCs w:val="20"/>
+        </w:rPr>
+        <w:t>} - ${</w:t>
+      </w:r>
+      <w:proofErr w:type="spellStart"/>
+      <w:r>
+        <w:rPr>
+          <w:rFonts w:ascii="Trebuchet MS" w:eastAsia="Arial" w:hAnsi="Trebuchet MS" w:cs="Arial"/>
+          <w:color w:val="00000A"/>
+          <w:sz w:val="20"/>
+          <w:szCs w:val="20"/>
+        </w:rPr>
+        <w:t>cidadeCandidato</w:t>
+      </w:r>
+      <w:proofErr w:type="spellEnd"/>
+      <w:r>
+        <w:rPr>
+          <w:rFonts w:ascii="Trebuchet MS" w:eastAsia="Arial" w:hAnsi="Trebuchet MS" w:cs="Arial"/>
+          <w:color w:val="00000A"/>
+          <w:sz w:val="20"/>
+          <w:szCs w:val="20"/>
+        </w:rPr>
+        <w:t>} - ${</w:t>
+      </w:r>
+      <w:proofErr w:type="spellStart"/>
+      <w:r>
+        <w:rPr>
+          <w:rFonts w:ascii="Trebuchet MS" w:eastAsia="Arial" w:hAnsi="Trebuchet MS" w:cs="Arial"/>
+          <w:color w:val="00000A"/>
+          <w:sz w:val="20"/>
+          <w:szCs w:val="20"/>
+        </w:rPr>
+        <w:t>cepCandidato</w:t>
+      </w:r>
+      <w:proofErr w:type="spellEnd"/>
+      <w:r>
+        <w:rPr>
+          <w:rFonts w:ascii="Trebuchet MS" w:eastAsia="Arial" w:hAnsi="Trebuchet MS" w:cs="Arial"/>
+          <w:color w:val="00000A"/>
+          <w:sz w:val="20"/>
+          <w:szCs w:val="20"/>
+        </w:rPr>
+        <w:t xml:space="preserve">}                                  </w:t>
       </w:r>
       <w:r>
         <w:rPr>
@@ -999,15 +1537,87 @@
           <w:szCs w:val="20"/>
         </w:rPr>
         <w:tab/>
-        <w:t xml:space="preserve">A Formação em Contexto de Trabalho comporta um total de ${fctHours} horas, as quais decorrerão no período compreendido entre </w:t>
-      </w:r>
-      <w:r>
-        <w:rPr>
-          <w:rFonts w:ascii="Trebuchet MS" w:eastAsia="Arial" w:hAnsi="Trebuchet MS" w:cs="Arial"/>
-          <w:sz w:val="20"/>
-          <w:szCs w:val="20"/>
-        </w:rPr>
-        <w:t>${dataInicial} á ${dataFinal},</w:t>
+        <w:t>A Formação em Contexto de Trabalho comporta um total de ${</w:t>
+      </w:r>
+      <w:proofErr w:type="spellStart"/>
+      <w:r>
+        <w:rPr>
+          <w:rFonts w:ascii="Trebuchet MS" w:hAnsi="Trebuchet MS"/>
+          <w:sz w:val="20"/>
+          <w:szCs w:val="20"/>
+        </w:rPr>
+        <w:t>fctHours</w:t>
+      </w:r>
+      <w:proofErr w:type="spellEnd"/>
+      <w:r>
+        <w:rPr>
+          <w:rFonts w:ascii="Trebuchet MS" w:hAnsi="Trebuchet MS"/>
+          <w:sz w:val="20"/>
+          <w:szCs w:val="20"/>
+        </w:rPr>
+        <w:t xml:space="preserve">} horas, as quais decorrerão no período compreendido entre </w:t>
+      </w:r>
+      <w:r>
+        <w:rPr>
+          <w:rFonts w:ascii="Trebuchet MS" w:eastAsia="Arial" w:hAnsi="Trebuchet MS" w:cs="Arial"/>
+          <w:sz w:val="20"/>
+          <w:szCs w:val="20"/>
+        </w:rPr>
+        <w:t>${</w:t>
+      </w:r>
+      <w:proofErr w:type="spellStart"/>
+      <w:r>
+        <w:rPr>
+          <w:rFonts w:ascii="Trebuchet MS" w:eastAsia="Arial" w:hAnsi="Trebuchet MS" w:cs="Arial"/>
+          <w:sz w:val="20"/>
+          <w:szCs w:val="20"/>
+        </w:rPr>
+        <w:t>dataInicial</w:t>
+      </w:r>
+      <w:proofErr w:type="spellEnd"/>
+      <w:r>
+        <w:rPr>
+          <w:rFonts w:ascii="Trebuchet MS" w:eastAsia="Arial" w:hAnsi="Trebuchet MS" w:cs="Arial"/>
+          <w:sz w:val="20"/>
+          <w:szCs w:val="20"/>
+        </w:rPr>
+        <w:t xml:space="preserve">} </w:t>
+      </w:r>
+      <w:proofErr w:type="gramStart"/>
+      <w:r>
+        <w:rPr>
+          <w:rFonts w:ascii="Trebuchet MS" w:eastAsia="Arial" w:hAnsi="Trebuchet MS" w:cs="Arial"/>
+          <w:sz w:val="20"/>
+          <w:szCs w:val="20"/>
+        </w:rPr>
+        <w:t>á</w:t>
+      </w:r>
+      <w:proofErr w:type="gramEnd"/>
+      <w:r>
+        <w:rPr>
+          <w:rFonts w:ascii="Trebuchet MS" w:eastAsia="Arial" w:hAnsi="Trebuchet MS" w:cs="Arial"/>
+          <w:sz w:val="20"/>
+          <w:szCs w:val="20"/>
+        </w:rPr>
+        <w:t xml:space="preserve"> ${</w:t>
+      </w:r>
+      <w:proofErr w:type="spellStart"/>
+      <w:r>
+        <w:rPr>
+          <w:rFonts w:ascii="Trebuchet MS" w:eastAsia="Arial" w:hAnsi="Trebuchet MS" w:cs="Arial"/>
+          <w:sz w:val="20"/>
+          <w:szCs w:val="20"/>
+        </w:rPr>
+        <w:t>dataFinal</w:t>
+      </w:r>
+      <w:proofErr w:type="spellEnd"/>
+      <w:r>
+        <w:rPr>
+          <w:rFonts w:ascii="Trebuchet MS" w:eastAsia="Arial" w:hAnsi="Trebuchet MS" w:cs="Arial"/>
+          <w:sz w:val="20"/>
+          <w:szCs w:val="20"/>
+        </w:rPr>
+        <w:t>},</w:t>
       </w:r>
       <w:r>
         <w:rPr>
@@ -1133,6 +1743,7 @@
           <w:szCs w:val="20"/>
         </w:rPr>
       </w:pPr>
+      <w:proofErr w:type="gramStart"/>
       <w:r>
         <w:rPr>
           <w:rFonts w:ascii="Trebuchet MS" w:hAnsi="Trebuchet MS"/>
@@ -1141,6 +1752,7 @@
         </w:rPr>
         <w:t>Cláusula Sexta</w:t>
       </w:r>
+      <w:proofErr w:type="gramEnd"/>
     </w:p>
     <w:p>
       <w:pPr>
@@ -1228,6 +1840,7 @@
           <w:szCs w:val="20"/>
         </w:rPr>
       </w:pPr>
+      <w:proofErr w:type="gramStart"/>
       <w:r>
         <w:rPr>
           <w:rFonts w:ascii="Trebuchet MS" w:hAnsi="Trebuchet MS"/>
@@ -1238,6 +1851,7 @@
         </w:rPr>
         <w:t>Cláusula Sétima</w:t>
       </w:r>
+      <w:proofErr w:type="gramEnd"/>
     </w:p>
     <w:p>
       <w:pPr>
@@ -1299,6 +1913,7 @@
           <w:szCs w:val="20"/>
         </w:rPr>
       </w:pPr>
+      <w:proofErr w:type="gramStart"/>
       <w:r>
         <w:rPr>
           <w:rFonts w:ascii="Trebuchet MS" w:hAnsi="Trebuchet MS"/>
@@ -1307,6 +1922,7 @@
         </w:rPr>
         <w:t>Cláusula Oitava</w:t>
       </w:r>
+      <w:proofErr w:type="gramEnd"/>
     </w:p>
     <w:p>
       <w:pPr>
@@ -1472,7 +2088,25 @@
           <w:sz w:val="20"/>
           <w:szCs w:val="20"/>
         </w:rPr>
-        <w:t xml:space="preserve">A relação entre as partes e entre as partes e formando rege-se exclusivamente pelas disposições do presente protocolo, não sendo aplicáveis a esta relação quaisquer normas legais de natureza laboral, normas internas do segundo outorgante, que apenas contemplem relações do tipo juslaboral. </w:t>
+        <w:t xml:space="preserve">A relação entre as partes e entre as partes e formando rege-se exclusivamente pelas disposições do presente protocolo, não sendo aplicáveis a esta relação quaisquer normas legais de natureza laboral, normas internas do segundo outorgante, que apenas contemplem relações do tipo </w:t>
+      </w:r>
+      <w:proofErr w:type="spellStart"/>
+      <w:r>
+        <w:rPr>
+          <w:rFonts w:ascii="Trebuchet MS" w:hAnsi="Trebuchet MS"/>
+          <w:sz w:val="20"/>
+          <w:szCs w:val="20"/>
+        </w:rPr>
+        <w:t>juslaboral</w:t>
+      </w:r>
+      <w:proofErr w:type="spellEnd"/>
+      <w:r>
+        <w:rPr>
+          <w:rFonts w:ascii="Trebuchet MS" w:hAnsi="Trebuchet MS"/>
+          <w:sz w:val="20"/>
+          <w:szCs w:val="20"/>
+        </w:rPr>
+        <w:t xml:space="preserve">. </w:t>
       </w:r>
     </w:p>
     <w:p>
@@ -1821,7 +2455,27 @@
           <w:sz w:val="20"/>
           <w:szCs w:val="20"/>
         </w:rPr>
-        <w:t>${ufEmpresa}</w:t>
+        <w:t>${</w:t>
+      </w:r>
+      <w:proofErr w:type="spellStart"/>
+      <w:r>
+        <w:rPr>
+          <w:rFonts w:ascii="Trebuchet MS" w:eastAsia="Arial" w:hAnsi="Trebuchet MS" w:cs="Arial"/>
+          <w:color w:val="00000A"/>
+          <w:sz w:val="20"/>
+          <w:szCs w:val="20"/>
+        </w:rPr>
+        <w:t>ufEmpresa</w:t>
+      </w:r>
+      <w:proofErr w:type="spellEnd"/>
+      <w:r>
+        <w:rPr>
+          <w:rFonts w:ascii="Trebuchet MS" w:eastAsia="Arial" w:hAnsi="Trebuchet MS" w:cs="Arial"/>
+          <w:color w:val="00000A"/>
+          <w:sz w:val="20"/>
+          <w:szCs w:val="20"/>
+        </w:rPr>
+        <w:t>}</w:t>
       </w:r>
       <w:r>
         <w:rPr>
@@ -2107,7 +2761,25 @@
         <w:sz w:val="14"/>
         <w:szCs w:val="14"/>
       </w:rPr>
-      <w:t>${razaoSocialEscola}</w:t>
+      <w:t>${</w:t>
+    </w:r>
+    <w:proofErr w:type="spellStart"/>
+    <w:r>
+      <w:rPr>
+        <w:rFonts w:ascii="Trebuchet MS" w:eastAsia="Trebuchet MS" w:hAnsi="Trebuchet MS" w:cs="Trebuchet MS"/>
+        <w:sz w:val="14"/>
+        <w:szCs w:val="14"/>
+      </w:rPr>
+      <w:t>razaoSocialEscola</w:t>
+    </w:r>
+    <w:proofErr w:type="spellEnd"/>
+    <w:r>
+      <w:rPr>
+        <w:rFonts w:ascii="Trebuchet MS" w:eastAsia="Trebuchet MS" w:hAnsi="Trebuchet MS" w:cs="Trebuchet MS"/>
+        <w:sz w:val="14"/>
+        <w:szCs w:val="14"/>
+      </w:rPr>
+      <w:t>}</w:t>
     </w:r>
   </w:p>
   <w:p>
@@ -2125,7 +2797,97 @@
         <w:sz w:val="14"/>
         <w:szCs w:val="14"/>
       </w:rPr>
-      <w:t>${enderecoEscola}, ${numeroEscola}, ${bairroEscola} -${cidadeEscola} - ${cepEscola}</w:t>
+      <w:t>${</w:t>
+    </w:r>
+    <w:proofErr w:type="spellStart"/>
+    <w:r>
+      <w:rPr>
+        <w:rFonts w:ascii="Trebuchet MS" w:eastAsia="Trebuchet MS" w:hAnsi="Trebuchet MS" w:cs="Trebuchet MS"/>
+        <w:sz w:val="14"/>
+        <w:szCs w:val="14"/>
+      </w:rPr>
+      <w:t>enderecoEscola</w:t>
+    </w:r>
+    <w:proofErr w:type="spellEnd"/>
+    <w:r>
+      <w:rPr>
+        <w:rFonts w:ascii="Trebuchet MS" w:eastAsia="Trebuchet MS" w:hAnsi="Trebuchet MS" w:cs="Trebuchet MS"/>
+        <w:sz w:val="14"/>
+        <w:szCs w:val="14"/>
+      </w:rPr>
+      <w:t>}, ${</w:t>
+    </w:r>
+    <w:proofErr w:type="spellStart"/>
+    <w:r>
+      <w:rPr>
+        <w:rFonts w:ascii="Trebuchet MS" w:eastAsia="Trebuchet MS" w:hAnsi="Trebuchet MS" w:cs="Trebuchet MS"/>
+        <w:sz w:val="14"/>
+        <w:szCs w:val="14"/>
+      </w:rPr>
+      <w:t>numeroEscola</w:t>
+    </w:r>
+    <w:proofErr w:type="spellEnd"/>
+    <w:r>
+      <w:rPr>
+        <w:rFonts w:ascii="Trebuchet MS" w:eastAsia="Trebuchet MS" w:hAnsi="Trebuchet MS" w:cs="Trebuchet MS"/>
+        <w:sz w:val="14"/>
+        <w:szCs w:val="14"/>
+      </w:rPr>
+      <w:t>}, ${</w:t>
+    </w:r>
+    <w:proofErr w:type="spellStart"/>
+    <w:r>
+      <w:rPr>
+        <w:rFonts w:ascii="Trebuchet MS" w:eastAsia="Trebuchet MS" w:hAnsi="Trebuchet MS" w:cs="Trebuchet MS"/>
+        <w:sz w:val="14"/>
+        <w:szCs w:val="14"/>
+      </w:rPr>
+      <w:t>bairroEscola</w:t>
+    </w:r>
+    <w:proofErr w:type="spellEnd"/>
+    <w:r>
+      <w:rPr>
+        <w:rFonts w:ascii="Trebuchet MS" w:eastAsia="Trebuchet MS" w:hAnsi="Trebuchet MS" w:cs="Trebuchet MS"/>
+        <w:sz w:val="14"/>
+        <w:szCs w:val="14"/>
+      </w:rPr>
+      <w:t>} -${</w:t>
+    </w:r>
+    <w:proofErr w:type="spellStart"/>
+    <w:r>
+      <w:rPr>
+        <w:rFonts w:ascii="Trebuchet MS" w:eastAsia="Trebuchet MS" w:hAnsi="Trebuchet MS" w:cs="Trebuchet MS"/>
+        <w:sz w:val="14"/>
+        <w:szCs w:val="14"/>
+      </w:rPr>
+      <w:t>cidadeEscola</w:t>
+    </w:r>
+    <w:proofErr w:type="spellEnd"/>
+    <w:r>
+      <w:rPr>
+        <w:rFonts w:ascii="Trebuchet MS" w:eastAsia="Trebuchet MS" w:hAnsi="Trebuchet MS" w:cs="Trebuchet MS"/>
+        <w:sz w:val="14"/>
+        <w:szCs w:val="14"/>
+      </w:rPr>
+      <w:t>} - ${</w:t>
+    </w:r>
+    <w:proofErr w:type="spellStart"/>
+    <w:r>
+      <w:rPr>
+        <w:rFonts w:ascii="Trebuchet MS" w:eastAsia="Trebuchet MS" w:hAnsi="Trebuchet MS" w:cs="Trebuchet MS"/>
+        <w:sz w:val="14"/>
+        <w:szCs w:val="14"/>
+      </w:rPr>
+      <w:t>cepEscola</w:t>
+    </w:r>
+    <w:proofErr w:type="spellEnd"/>
+    <w:r>
+      <w:rPr>
+        <w:rFonts w:ascii="Trebuchet MS" w:eastAsia="Trebuchet MS" w:hAnsi="Trebuchet MS" w:cs="Trebuchet MS"/>
+        <w:sz w:val="14"/>
+        <w:szCs w:val="14"/>
+      </w:rPr>
+      <w:t>}</w:t>
     </w:r>
   </w:p>
   <w:p>
@@ -2143,7 +2905,25 @@
         <w:sz w:val="14"/>
         <w:szCs w:val="14"/>
       </w:rPr>
-      <w:t>Telefone. ${telefoneEscola}</w:t>
+      <w:t>Telefone. ${</w:t>
+    </w:r>
+    <w:proofErr w:type="spellStart"/>
+    <w:r>
+      <w:rPr>
+        <w:rFonts w:ascii="Trebuchet MS" w:eastAsia="Trebuchet MS" w:hAnsi="Trebuchet MS" w:cs="Trebuchet MS"/>
+        <w:sz w:val="14"/>
+        <w:szCs w:val="14"/>
+      </w:rPr>
+      <w:t>telefoneEscola</w:t>
+    </w:r>
+    <w:proofErr w:type="spellEnd"/>
+    <w:r>
+      <w:rPr>
+        <w:rFonts w:ascii="Trebuchet MS" w:eastAsia="Trebuchet MS" w:hAnsi="Trebuchet MS" w:cs="Trebuchet MS"/>
+        <w:sz w:val="14"/>
+        <w:szCs w:val="14"/>
+      </w:rPr>
+      <w:t>}</w:t>
     </w:r>
   </w:p>
   <w:p>
@@ -2168,7 +2948,26 @@
         <w:lang w:val="fr-FR"/>
       </w:rPr>
       <w:tab/>
-      <w:t xml:space="preserve">Página </w:t>
+    </w:r>
+    <w:proofErr w:type="spellStart"/>
+    <w:r>
+      <w:rPr>
+        <w:rFonts w:ascii="Trebuchet MS" w:hAnsi="Trebuchet MS"/>
+        <w:sz w:val="14"/>
+        <w:szCs w:val="14"/>
+        <w:lang w:val="fr-FR"/>
+      </w:rPr>
+      <w:t>Página</w:t>
+    </w:r>
+    <w:proofErr w:type="spellEnd"/>
+    <w:r>
+      <w:rPr>
+        <w:rFonts w:ascii="Trebuchet MS" w:hAnsi="Trebuchet MS"/>
+        <w:sz w:val="14"/>
+        <w:szCs w:val="14"/>
+        <w:lang w:val="fr-FR"/>
+      </w:rPr>
+      <w:t xml:space="preserve"> </w:t>
     </w:r>
     <w:r>
       <w:rPr>
@@ -2313,7 +3112,25 @@
         <w:sz w:val="14"/>
         <w:szCs w:val="14"/>
       </w:rPr>
-      <w:t>${razaoSocialEscola}</w:t>
+      <w:t>${</w:t>
+    </w:r>
+    <w:proofErr w:type="spellStart"/>
+    <w:r>
+      <w:rPr>
+        <w:rFonts w:ascii="Trebuchet MS" w:eastAsia="Trebuchet MS" w:hAnsi="Trebuchet MS" w:cs="Trebuchet MS"/>
+        <w:sz w:val="14"/>
+        <w:szCs w:val="14"/>
+      </w:rPr>
+      <w:t>razaoSocialEscola</w:t>
+    </w:r>
+    <w:proofErr w:type="spellEnd"/>
+    <w:r>
+      <w:rPr>
+        <w:rFonts w:ascii="Trebuchet MS" w:eastAsia="Trebuchet MS" w:hAnsi="Trebuchet MS" w:cs="Trebuchet MS"/>
+        <w:sz w:val="14"/>
+        <w:szCs w:val="14"/>
+      </w:rPr>
+      <w:t>}</w:t>
     </w:r>
   </w:p>
   <w:p>
@@ -2331,7 +3148,97 @@
         <w:sz w:val="14"/>
         <w:szCs w:val="14"/>
       </w:rPr>
-      <w:t>${enderecoEscola}, ${numeroEscola}, ${bairroEscola} -${cidadeEscola} - ${cepEscola}</w:t>
+      <w:t>${</w:t>
+    </w:r>
+    <w:proofErr w:type="spellStart"/>
+    <w:r>
+      <w:rPr>
+        <w:rFonts w:ascii="Trebuchet MS" w:eastAsia="Trebuchet MS" w:hAnsi="Trebuchet MS" w:cs="Trebuchet MS"/>
+        <w:sz w:val="14"/>
+        <w:szCs w:val="14"/>
+      </w:rPr>
+      <w:t>enderecoEscola</w:t>
+    </w:r>
+    <w:proofErr w:type="spellEnd"/>
+    <w:r>
+      <w:rPr>
+        <w:rFonts w:ascii="Trebuchet MS" w:eastAsia="Trebuchet MS" w:hAnsi="Trebuchet MS" w:cs="Trebuchet MS"/>
+        <w:sz w:val="14"/>
+        <w:szCs w:val="14"/>
+      </w:rPr>
+      <w:t>}, ${</w:t>
+    </w:r>
+    <w:proofErr w:type="spellStart"/>
+    <w:r>
+      <w:rPr>
+        <w:rFonts w:ascii="Trebuchet MS" w:eastAsia="Trebuchet MS" w:hAnsi="Trebuchet MS" w:cs="Trebuchet MS"/>
+        <w:sz w:val="14"/>
+        <w:szCs w:val="14"/>
+      </w:rPr>
+      <w:t>numeroEscola</w:t>
+    </w:r>
+    <w:proofErr w:type="spellEnd"/>
+    <w:r>
+      <w:rPr>
+        <w:rFonts w:ascii="Trebuchet MS" w:eastAsia="Trebuchet MS" w:hAnsi="Trebuchet MS" w:cs="Trebuchet MS"/>
+        <w:sz w:val="14"/>
+        <w:szCs w:val="14"/>
+      </w:rPr>
+      <w:t>}, ${</w:t>
+    </w:r>
+    <w:proofErr w:type="spellStart"/>
+    <w:r>
+      <w:rPr>
+        <w:rFonts w:ascii="Trebuchet MS" w:eastAsia="Trebuchet MS" w:hAnsi="Trebuchet MS" w:cs="Trebuchet MS"/>
+        <w:sz w:val="14"/>
+        <w:szCs w:val="14"/>
+      </w:rPr>
+      <w:t>bairroEscola</w:t>
+    </w:r>
+    <w:proofErr w:type="spellEnd"/>
+    <w:r>
+      <w:rPr>
+        <w:rFonts w:ascii="Trebuchet MS" w:eastAsia="Trebuchet MS" w:hAnsi="Trebuchet MS" w:cs="Trebuchet MS"/>
+        <w:sz w:val="14"/>
+        <w:szCs w:val="14"/>
+      </w:rPr>
+      <w:t>} -${</w:t>
+    </w:r>
+    <w:proofErr w:type="spellStart"/>
+    <w:r>
+      <w:rPr>
+        <w:rFonts w:ascii="Trebuchet MS" w:eastAsia="Trebuchet MS" w:hAnsi="Trebuchet MS" w:cs="Trebuchet MS"/>
+        <w:sz w:val="14"/>
+        <w:szCs w:val="14"/>
+      </w:rPr>
+      <w:t>cidadeEscola</w:t>
+    </w:r>
+    <w:proofErr w:type="spellEnd"/>
+    <w:r>
+      <w:rPr>
+        <w:rFonts w:ascii="Trebuchet MS" w:eastAsia="Trebuchet MS" w:hAnsi="Trebuchet MS" w:cs="Trebuchet MS"/>
+        <w:sz w:val="14"/>
+        <w:szCs w:val="14"/>
+      </w:rPr>
+      <w:t>} - ${</w:t>
+    </w:r>
+    <w:proofErr w:type="spellStart"/>
+    <w:r>
+      <w:rPr>
+        <w:rFonts w:ascii="Trebuchet MS" w:eastAsia="Trebuchet MS" w:hAnsi="Trebuchet MS" w:cs="Trebuchet MS"/>
+        <w:sz w:val="14"/>
+        <w:szCs w:val="14"/>
+      </w:rPr>
+      <w:t>cepEscola</w:t>
+    </w:r>
+    <w:proofErr w:type="spellEnd"/>
+    <w:r>
+      <w:rPr>
+        <w:rFonts w:ascii="Trebuchet MS" w:eastAsia="Trebuchet MS" w:hAnsi="Trebuchet MS" w:cs="Trebuchet MS"/>
+        <w:sz w:val="14"/>
+        <w:szCs w:val="14"/>
+      </w:rPr>
+      <w:t>}</w:t>
     </w:r>
   </w:p>
   <w:p>
@@ -2349,7 +3256,25 @@
         <w:sz w:val="14"/>
         <w:szCs w:val="14"/>
       </w:rPr>
-      <w:t>Telefone. ${telefoneEscola}</w:t>
+      <w:t>Telefone. ${</w:t>
+    </w:r>
+    <w:proofErr w:type="spellStart"/>
+    <w:r>
+      <w:rPr>
+        <w:rFonts w:ascii="Trebuchet MS" w:eastAsia="Trebuchet MS" w:hAnsi="Trebuchet MS" w:cs="Trebuchet MS"/>
+        <w:sz w:val="14"/>
+        <w:szCs w:val="14"/>
+      </w:rPr>
+      <w:t>telefoneEscola</w:t>
+    </w:r>
+    <w:proofErr w:type="spellEnd"/>
+    <w:r>
+      <w:rPr>
+        <w:rFonts w:ascii="Trebuchet MS" w:eastAsia="Trebuchet MS" w:hAnsi="Trebuchet MS" w:cs="Trebuchet MS"/>
+        <w:sz w:val="14"/>
+        <w:szCs w:val="14"/>
+      </w:rPr>
+      <w:t>}</w:t>
     </w:r>
   </w:p>
   <w:p>
@@ -2374,7 +3299,26 @@
         <w:lang w:val="fr-FR"/>
       </w:rPr>
       <w:tab/>
-      <w:t xml:space="preserve">Página </w:t>
+    </w:r>
+    <w:proofErr w:type="spellStart"/>
+    <w:r>
+      <w:rPr>
+        <w:rFonts w:ascii="Trebuchet MS" w:hAnsi="Trebuchet MS"/>
+        <w:sz w:val="14"/>
+        <w:szCs w:val="14"/>
+        <w:lang w:val="fr-FR"/>
+      </w:rPr>
+      <w:t>Página</w:t>
+    </w:r>
+    <w:proofErr w:type="spellEnd"/>
+    <w:r>
+      <w:rPr>
+        <w:rFonts w:ascii="Trebuchet MS" w:hAnsi="Trebuchet MS"/>
+        <w:sz w:val="14"/>
+        <w:szCs w:val="14"/>
+        <w:lang w:val="fr-FR"/>
+      </w:rPr>
+      <w:t xml:space="preserve"> </w:t>
     </w:r>
     <w:r>
       <w:rPr>

</xml_diff>